<commit_message>
docs: correct loss function progression in Q&A report (V2 uses Cross-Entropy)
</commit_message>
<xml_diff>
--- a/docs/progressive_qna_report.docx
+++ b/docs/progressive_qna_report.docx
@@ -286,7 +286,7 @@
           <w:i w:val="0"/>
           <w:sz w:val="26"/>
         </w:rPr>
-        <w:t>Nhận thấy mất cân bằng dữ liệu cản trở quá trình học của các lớp thiểu số, nhóm nghiên cứu thay thế hoàn toàn CrossEntropy Loss bằng Class-Balanced Focal Loss, áp dụng hệ số trọng số nghịch đảo mẫu hiệu dụng và cơ chế tập trung vào các mẫu khó học.</w:t>
+        <w:t>Phiên bản V2 vẫn tiếp tục sử dụng hàm tổn thất CrossEntropy Loss tiêu chuẩn giống như phiên bản V1. Sự tập trung cải tiến chính của V2 nằm ở khâu làm sạch dữ liệu nguồn và thiết kế tăng cường ảnh ngoại tuyến (giả lập thời tiết/camera) để nâng cao khả năng tổng quát hóa của mô hình.</w:t>
       </w:r>
     </w:p>
     <w:p>
@@ -406,7 +406,7 @@
           <w:i w:val="0"/>
           <w:sz w:val="26"/>
         </w:rPr>
-        <w:t>Tích hợp thêm Enhanced Pairwise Margin Loss vào Class-Balanced Focal Loss. Hàm loss phụ này áp đặt hình phạt biên logits bắt buộc (margin m = 0.35, lambda = 0.15) để kéo giãn ranh giới quyết định giữa các cặp lớp dễ nhầm lẫn nhất.</w:t>
+        <w:t>Tích hợp hàm Class-Balanced Focal Loss (beta = 0.999, gamma = 2.0, label smoothing = 0.1) làm loss chính để xử lý mất cân bằng mẫu, phối hợp cùng Enhanced Pairwise Margin Loss làm loss phụ. Hàm loss phụ này áp đặt hình phạt biên logits bắt buộc (margin m = 0.35, lambda = 0.15) để kéo giãn ranh giới quyết định giữa các cặp lớp dễ nhầm lẫn nhất.</w:t>
       </w:r>
     </w:p>
     <w:p>
@@ -769,7 +769,7 @@
           <w:b/>
           <w:sz w:val="26"/>
         </w:rPr>
-        <w:t>Câu 7: Tại sao Class-Balanced Focal Loss tối ưu hơn CrossEntropy Loss trong bài toán mất cân bằng dữ liệu này?</w:t>
+        <w:t>Câu 7: Tại sao hàm tổn thất lai của phiên bản V3 (Class-Balanced Focal Loss + Pairwise Margin Loss) lại tối ưu hơn CrossEntropy Loss tiêu chuẩn của V1/V2?</w:t>
       </w:r>
     </w:p>
     <w:p>
@@ -784,7 +784,7 @@
           <w:i w:val="0"/>
           <w:sz w:val="26"/>
         </w:rPr>
-        <w:t>Trả lời: CrossEntropy Loss coi mọi mẫu có vai trò ngang nhau, dẫn đến việc các lớp đa số (như boat và car) áp đảo hoàn toàn đạo hàm cập nhật trọng số, làm mô hình lơ là các lớp thiểu số (như helicopter). Class-Balanced Focal Loss kết hợp hai cơ chế xử lý:</w:t>
+        <w:t>Trả lời: CrossEntropy Loss mặc định dùng ở V1/V2 coi mọi mẫu có vai trò ngang nhau và chỉ độc lập tối ưu xác suất của lớp đúng. Điều này dẫn đến hai lỗi nghiêm trọng:</w:t>
       </w:r>
     </w:p>
     <w:p>
@@ -800,7 +800,7 @@
           <w:i w:val="0"/>
           <w:sz w:val="26"/>
         </w:rPr>
-        <w:t>1. Hệ số Class-Balanced Weight tỷ lệ nghịch với số lượng mẫu hiệu dụng (beta = 0.999), giúp cân bằng tỷ lệ gradient giữa các lớp dựa trên không gian đặc trưng thực tế thay vì số mẫu thuần túy.</w:t>
+        <w:t>1. Không xử lý được mất cân bằng mẫu: Các lớp đa số (boat, car) áp đảo hoàn toàn gradient làm lu mờ các lớp thiểu số. V3 giải quyết bằng Class-Balanced Focal Loss với hệ số mẫu hiệu dụng (beta = 0.999) và Focal term (gamma = 2.0) giúp triệt tiêu gradient của mẫu dễ học, buộc mô hình tập trung vào mẫu khó.</w:t>
       </w:r>
     </w:p>
     <w:p>
@@ -816,7 +816,7 @@
           <w:i w:val="0"/>
           <w:sz w:val="26"/>
         </w:rPr>
-        <w:t>2. Hệ số Focal Term (1 - p_t)^gamma (gamma = 2.0) giúp giảm thiểu mạnh mẽ đóng góp loss từ các mẫu dễ học (p_t tiến sát 1), giữ nguyên loss ở các mẫu khó học, ép mô hình phải tập trung học các đặc trưng ranh giới phân loại.</w:t>
+        <w:t>2. Bỏ qua sự nhập nhèm giữa các lớp tương đồng hình thái: CE không có cơ chế phạt sự nhầm lẫn giữa car và truck. V3 tích hợp thêm Pairwise Margin Loss áp đặt hình phạt biên logits bắt buộc (margin m = 0.35, lambda = 0.15) để chủ động giãn biên logits giữa các cặp xe hay nhầm lẫn chéo, định hình ranh giới quyết định sắc bén hơn.</w:t>
       </w:r>
     </w:p>
     <w:p>
@@ -996,7 +996,7 @@
           <w:b/>
           <w:sz w:val="26"/>
         </w:rPr>
-        <w:t>Câu 13: Bộ lập lịch Cosine Learning Rate Decay có ưu điểm gì so với bộ lập lịch suy giảm bước (Step Decay) hay ReduceLROnPlateau?</w:t>
+        <w:t>Câu 13: Bộ lập lịch Cosine Learning Rate Decay có ưu điểm gì so với bộ lập lịch ReduceLROnPlateau?</w:t>
       </w:r>
     </w:p>
     <w:p>
@@ -1011,7 +1011,7 @@
           <w:i w:val="0"/>
           <w:sz w:val="26"/>
         </w:rPr>
-        <w:t>Trả lời: Cosine Decay thực hiện suy giảm tốc độ học theo quỹ đạo hàm cosine mịn màng dần về 0. Khác với Step Decay giảm đột ngột tạo ra các cú sốc gradient (gradient shock), Cosine Decay giúp mô hình thích ứng mượt mà ở các epoch cuối, hỗ trợ các tham số tiếp cận ranh giới tối ưu tiệm cận biên phạt lề cứng một cách ổn định, cải thiện khả năng tổng quát hóa.</w:t>
+        <w:t>Trả lời: Cosine Decay thực hiện suy giảm tốc độ học theo quỹ đạo hàm cosine mịn màng dần về 0. Khác với ReduceLROnPlateau giảm theo từng bậc gián đoạn (step drop) dễ gây sốc gradient cho các biên lề phạt margin cứng, Cosine Decay giúp mô hình thích ứng mượt mà ở các epoch cuối, hỗ trợ các tham số tiếp cận ranh giới tối ưu tiệm cận biên phạt lề một cách ổn định, cải thiện khả năng tổng quát hóa.</w:t>
       </w:r>
     </w:p>
     <w:p>

</xml_diff>